<commit_message>
docs(fmcg): add hard UoM/price Go/No-Go controls + post-pilot backlog
Adds three blocking Go/No-Go controls from the master-data audit (pilot loop is
base-unit only): UoM-1 single base UoM per SKU; UoM-2 van stock unit = sales
unit; PRICE every SKU resolves to a positive price for a sample customer before
activation. Records the frozen post-pilot backlog item 'Multi-UoM Sales &
Inventory Conversion' (carton/pack/box/piece selling, conversion factors,
inventory conversion, pricing by UoM, mixed-UoM transactions). Runbook + Word
package updated. Documentation only; scope remains frozen, no feature work.

https://claude.ai/code/session_01AnB42F2fTvBjmAfvzDNk4V
</commit_message>
<xml_diff>
--- a/docs/architecture/fmcg/VANTORA-FMCG-Pilot-Package.docx
+++ b/docs/architecture/fmcg/VANTORA-FMCG-Pilot-Package.docx
@@ -1102,6 +1102,257 @@
           <w:sz w:val="20"/>
         </w:rPr>
         <w:t>Instant rollback: unset KAKO_VAN_SALES (or set erp_van_sales_settings.is_enabled = false) — all surfaces go inert, no data lost.</w:t>
+      </w:r>
+    </w:p>
+    <w:p>
+      <w:pPr>
+        <w:spacing w:before="280" w:after="80"/>
+      </w:pPr>
+      <w:r>
+        <w:rPr>
+          <w:b/>
+          <w:color w:val="B3261E"/>
+          <w:sz w:val="22"/>
+        </w:rPr>
+        <w:t>2.1  HARD UoM &amp; Pricing Controls (blocking)</w:t>
+      </w:r>
+    </w:p>
+    <w:p>
+      <w:pPr>
+        <w:spacing w:after="80"/>
+      </w:pPr>
+      <w:r>
+        <w:rPr>
+          <w:b w:val="0"/>
+          <w:i/>
+          <w:sz w:val="20"/>
+        </w:rPr>
+        <w:t>From the master-data audit: the pilot loop is BASE-UNIT only — UoM conversion factors are not applied at point of sale. The following three controls are MANDATORY before activation.</w:t>
+      </w:r>
+    </w:p>
+    <w:tbl>
+      <w:tblPr>
+        <w:tblStyle w:val="TableGrid"/>
+        <w:tblW w:type="auto" w:w="0"/>
+        <w:jc w:val="left"/>
+        <w:tblLayout w:type="fixed"/>
+        <w:tblLook w:firstColumn="1" w:firstRow="1" w:lastColumn="0" w:lastRow="0" w:noHBand="0" w:noVBand="1" w:val="04A0"/>
+      </w:tblPr>
+      <w:tblGrid>
+        <w:gridCol w:w="2880"/>
+        <w:gridCol w:w="2880"/>
+        <w:gridCol w:w="2880"/>
+      </w:tblGrid>
+      <w:tr>
+        <w:tc>
+          <w:tcPr>
+            <w:tcW w:type="dxa" w:w="1008"/>
+            <w:shd w:val="clear" w:fill="1F3864"/>
+          </w:tcPr>
+          <w:p>
+            <w:r/>
+            <w:r>
+              <w:rPr>
+                <w:b/>
+                <w:color w:val="FFFFFF"/>
+                <w:sz w:val="18"/>
+              </w:rPr>
+              <w:t>#</w:t>
+            </w:r>
+          </w:p>
+        </w:tc>
+        <w:tc>
+          <w:tcPr>
+            <w:tcW w:type="dxa" w:w="4752"/>
+            <w:shd w:val="clear" w:fill="1F3864"/>
+          </w:tcPr>
+          <w:p>
+            <w:r/>
+            <w:r>
+              <w:rPr>
+                <w:b/>
+                <w:color w:val="FFFFFF"/>
+                <w:sz w:val="18"/>
+              </w:rPr>
+              <w:t>Control</w:t>
+            </w:r>
+          </w:p>
+        </w:tc>
+        <w:tc>
+          <w:tcPr>
+            <w:tcW w:type="dxa" w:w="4320"/>
+            <w:shd w:val="clear" w:fill="1F3864"/>
+          </w:tcPr>
+          <w:p>
+            <w:r/>
+            <w:r>
+              <w:rPr>
+                <w:b/>
+                <w:color w:val="FFFFFF"/>
+                <w:sz w:val="18"/>
+              </w:rPr>
+              <w:t>Why</w:t>
+            </w:r>
+          </w:p>
+        </w:tc>
+      </w:tr>
+      <w:tr>
+        <w:tc>
+          <w:tcPr>
+            <w:tcW w:type="dxa" w:w="1008"/>
+          </w:tcPr>
+          <w:p>
+            <w:r/>
+            <w:r>
+              <w:rPr>
+                <w:b/>
+                <w:color w:val="B3261E"/>
+                <w:sz w:val="17"/>
+              </w:rPr>
+              <w:t>UoM-1</w:t>
+            </w:r>
+          </w:p>
+        </w:tc>
+        <w:tc>
+          <w:tcPr>
+            <w:tcW w:type="dxa" w:w="4752"/>
+          </w:tcPr>
+          <w:p>
+            <w:r/>
+            <w:r>
+              <w:rPr>
+                <w:b w:val="0"/>
+                <w:sz w:val="17"/>
+              </w:rPr>
+              <w:t>Every pilot SKU operates with a single base UoM.</w:t>
+            </w:r>
+          </w:p>
+        </w:tc>
+        <w:tc>
+          <w:tcPr>
+            <w:tcW w:type="dxa" w:w="4320"/>
+          </w:tcPr>
+          <w:p>
+            <w:r/>
+            <w:r>
+              <w:rPr>
+                <w:b w:val="0"/>
+                <w:sz w:val="17"/>
+              </w:rPr>
+              <w:t>No SKU relies on carton↔piece conversion at sale.</w:t>
+            </w:r>
+          </w:p>
+        </w:tc>
+      </w:tr>
+      <w:tr>
+        <w:tc>
+          <w:tcPr>
+            <w:tcW w:type="dxa" w:w="1008"/>
+          </w:tcPr>
+          <w:p>
+            <w:r/>
+            <w:r>
+              <w:rPr>
+                <w:b/>
+                <w:color w:val="B3261E"/>
+                <w:sz w:val="17"/>
+              </w:rPr>
+              <w:t>UoM-2</w:t>
+            </w:r>
+          </w:p>
+        </w:tc>
+        <w:tc>
+          <w:tcPr>
+            <w:tcW w:type="dxa" w:w="4752"/>
+          </w:tcPr>
+          <w:p>
+            <w:r/>
+            <w:r>
+              <w:rPr>
+                <w:b w:val="0"/>
+                <w:sz w:val="17"/>
+              </w:rPr>
+              <w:t>Van stock quantities and sales quantities use the same base unit.</w:t>
+            </w:r>
+          </w:p>
+        </w:tc>
+        <w:tc>
+          <w:tcPr>
+            <w:tcW w:type="dxa" w:w="4320"/>
+          </w:tcPr>
+          <w:p>
+            <w:r/>
+            <w:r>
+              <w:rPr>
+                <w:b w:val="0"/>
+                <w:sz w:val="17"/>
+              </w:rPr>
+              <w:t>Keeps van = loaded − sold + returned without conversion.</w:t>
+            </w:r>
+          </w:p>
+        </w:tc>
+      </w:tr>
+      <w:tr>
+        <w:tc>
+          <w:tcPr>
+            <w:tcW w:type="dxa" w:w="1008"/>
+          </w:tcPr>
+          <w:p>
+            <w:r/>
+            <w:r>
+              <w:rPr>
+                <w:b/>
+                <w:color w:val="B3261E"/>
+                <w:sz w:val="17"/>
+              </w:rPr>
+              <w:t>PRICE</w:t>
+            </w:r>
+          </w:p>
+        </w:tc>
+        <w:tc>
+          <w:tcPr>
+            <w:tcW w:type="dxa" w:w="4752"/>
+          </w:tcPr>
+          <w:p>
+            <w:r/>
+            <w:r>
+              <w:rPr>
+                <w:b w:val="0"/>
+                <w:sz w:val="17"/>
+              </w:rPr>
+              <w:t>Every pilot SKU resolves to a positive price for a sample customer before activation.</w:t>
+            </w:r>
+          </w:p>
+        </w:tc>
+        <w:tc>
+          <w:tcPr>
+            <w:tcW w:type="dxa" w:w="4320"/>
+          </w:tcPr>
+          <w:p>
+            <w:r/>
+            <w:r>
+              <w:rPr>
+                <w:b w:val="0"/>
+                <w:sz w:val="17"/>
+              </w:rPr>
+              <w:t>sell_price &gt; 0 is not enforced by code; this gate enforces it (no 0-price sales).</w:t>
+            </w:r>
+          </w:p>
+        </w:tc>
+      </w:tr>
+    </w:tbl>
+    <w:p>
+      <w:pPr>
+        <w:spacing w:after="80"/>
+      </w:pPr>
+      <w:r>
+        <w:rPr>
+          <w:b/>
+          <w:i w:val="0"/>
+          <w:color w:val="B3261E"/>
+          <w:sz w:val="19"/>
+        </w:rPr>
+        <w:t>Verify each by running a price preview / test sale per SKU. A single failing SKU is a NO-GO until corrected.</w:t>
       </w:r>
     </w:p>
     <w:p>
@@ -5210,6 +5461,134 @@
         </w:tc>
       </w:tr>
     </w:tbl>
+    <w:p>
+      <w:r>
+        <w:br w:type="page"/>
+      </w:r>
+    </w:p>
+    <w:p>
+      <w:pPr>
+        <w:spacing w:before="280" w:after="80"/>
+      </w:pPr>
+      <w:r>
+        <w:rPr>
+          <w:b/>
+          <w:color w:val="1F3864"/>
+          <w:sz w:val="25"/>
+        </w:rPr>
+        <w:t>Appendix A.  Post-Pilot Backlog (frozen — not for pilot)</w:t>
+      </w:r>
+    </w:p>
+    <w:p>
+      <w:pPr>
+        <w:spacing w:before="280" w:after="80"/>
+      </w:pPr>
+      <w:r>
+        <w:rPr>
+          <w:b/>
+          <w:color w:val="1F3864"/>
+          <w:sz w:val="22"/>
+        </w:rPr>
+        <w:t>Multi-UoM Sales &amp; Inventory Conversion</w:t>
+      </w:r>
+    </w:p>
+    <w:p>
+      <w:pPr>
+        <w:spacing w:after="80"/>
+      </w:pPr>
+      <w:r>
+        <w:rPr>
+          <w:b w:val="0"/>
+          <w:i/>
+          <w:sz w:val="20"/>
+        </w:rPr>
+        <w:t>The pilot is intentionally single-base-UoM (Go/No-Go controls UoM-1 / UoM-2). This item wires multi-UoM end to end AFTER the pilot.</w:t>
+      </w:r>
+    </w:p>
+    <w:p>
+      <w:pPr>
+        <w:pStyle w:val="ListBullet"/>
+        <w:spacing w:after="80"/>
+      </w:pPr>
+      <w:r>
+        <w:rPr>
+          <w:b w:val="0"/>
+          <w:i w:val="0"/>
+          <w:sz w:val="20"/>
+        </w:rPr>
+        <w:t>Carton / Pack / Box / Piece selling — pick the unit at point of sale.</w:t>
+      </w:r>
+    </w:p>
+    <w:p>
+      <w:pPr>
+        <w:pStyle w:val="ListBullet"/>
+        <w:spacing w:after="80"/>
+      </w:pPr>
+      <w:r>
+        <w:rPr>
+          <w:b w:val="0"/>
+          <w:i w:val="0"/>
+          <w:sz w:val="20"/>
+        </w:rPr>
+        <w:t>Conversion factors — apply erp_product_uoms.factor across the sell / return / invoice / stock paths.</w:t>
+      </w:r>
+    </w:p>
+    <w:p>
+      <w:pPr>
+        <w:pStyle w:val="ListBullet"/>
+        <w:spacing w:after="80"/>
+      </w:pPr>
+      <w:r>
+        <w:rPr>
+          <w:b w:val="0"/>
+          <w:i w:val="0"/>
+          <w:sz w:val="20"/>
+        </w:rPr>
+        <w:t>Inventory conversion — decrement/restock van + warehouse stock in base units regardless of the sold unit; keep the ledger consistent.</w:t>
+      </w:r>
+    </w:p>
+    <w:p>
+      <w:pPr>
+        <w:pStyle w:val="ListBullet"/>
+        <w:spacing w:after="80"/>
+      </w:pPr>
+      <w:r>
+        <w:rPr>
+          <w:b w:val="0"/>
+          <w:i w:val="0"/>
+          <w:sz w:val="20"/>
+        </w:rPr>
+        <w:t>Pricing by UoM — resolve price per selling unit (extend erp_resolve_price).</w:t>
+      </w:r>
+    </w:p>
+    <w:p>
+      <w:pPr>
+        <w:pStyle w:val="ListBullet"/>
+        <w:spacing w:after="80"/>
+      </w:pPr>
+      <w:r>
+        <w:rPr>
+          <w:b w:val="0"/>
+          <w:i w:val="0"/>
+          <w:sz w:val="20"/>
+        </w:rPr>
+        <w:t>Mixed-UoM transactions — multiple units across lines on one document.</w:t>
+      </w:r>
+    </w:p>
+    <w:p>
+      <w:pPr>
+        <w:spacing w:after="80"/>
+      </w:pPr>
+      <w:r>
+        <w:rPr>
+          <w:b/>
+          <w:i w:val="0"/>
+          <w:color w:val="B06A00"/>
+          <w:sz w:val="20"/>
+        </w:rPr>
+        <w:t>Status: deferred. Do not build during the pilot. Revisit after a clean pilot run, or earlier only if a pilot blocker is discovered.</w:t>
+      </w:r>
+    </w:p>
     <w:p/>
     <w:p>
       <w:r>

</xml_diff>